<commit_message>
Random generator hiba kijavitva
</commit_message>
<xml_diff>
--- a/SZOFTECH_Lab3_R29SVR.docx
+++ b/SZOFTECH_Lab3_R29SVR.docx
@@ -302,7 +302,15 @@
         <w:t xml:space="preserve">Feladat: </w:t>
       </w:r>
       <w:r>
-        <w:t>CI feladatok (GitHub Actions)</w:t>
+        <w:t xml:space="preserve">CI feladatok (GitHub </w:t>
+      </w:r>
+      <w:proofErr w:type="spellStart"/>
+      <w:r>
+        <w:t>Actions</w:t>
+      </w:r>
+      <w:proofErr w:type="spellEnd"/>
+      <w:r>
+        <w:t>)</w:t>
       </w:r>
     </w:p>
     <w:p>
@@ -357,49 +365,222 @@
         <w:pStyle w:val="Cmsor1"/>
       </w:pPr>
       <w:r>
-        <w:t>Feladat: Reset és revert</w:t>
+        <w:lastRenderedPageBreak/>
+        <w:t xml:space="preserve">Feladat: </w:t>
+      </w:r>
+      <w:r>
+        <w:t xml:space="preserve">Távoli </w:t>
+      </w:r>
+      <w:proofErr w:type="spellStart"/>
+      <w:r>
+        <w:t>Git</w:t>
+      </w:r>
+      <w:proofErr w:type="spellEnd"/>
+      <w:r>
+        <w:t xml:space="preserve"> kezelés: eltérés a lokális és távoli ág között</w:t>
       </w:r>
     </w:p>
     <w:p>
       <w:pPr>
         <w:pStyle w:val="Code"/>
       </w:pPr>
+      <w:r>
+        <w:drawing>
+          <wp:inline distT="0" distB="0" distL="0" distR="0" wp14:anchorId="733878D9" wp14:editId="76C5AE84">
+            <wp:extent cx="5760720" cy="6304915"/>
+            <wp:effectExtent l="0" t="0" r="0" b="0"/>
+            <wp:docPr id="1512710008" name="Kép 1"/>
+            <wp:cNvGraphicFramePr>
+              <a:graphicFrameLocks xmlns:a="http://schemas.openxmlformats.org/drawingml/2006/main" noChangeAspect="1"/>
+            </wp:cNvGraphicFramePr>
+            <a:graphic xmlns:a="http://schemas.openxmlformats.org/drawingml/2006/main">
+              <a:graphicData uri="http://schemas.openxmlformats.org/drawingml/2006/picture">
+                <pic:pic xmlns:pic="http://schemas.openxmlformats.org/drawingml/2006/picture">
+                  <pic:nvPicPr>
+                    <pic:cNvPr id="1512710008" name=""/>
+                    <pic:cNvPicPr/>
+                  </pic:nvPicPr>
+                  <pic:blipFill>
+                    <a:blip r:embed="rId14"/>
+                    <a:stretch>
+                      <a:fillRect/>
+                    </a:stretch>
+                  </pic:blipFill>
+                  <pic:spPr>
+                    <a:xfrm>
+                      <a:off x="0" y="0"/>
+                      <a:ext cx="5760720" cy="6304915"/>
+                    </a:xfrm>
+                    <a:prstGeom prst="rect">
+                      <a:avLst/>
+                    </a:prstGeom>
+                  </pic:spPr>
+                </pic:pic>
+              </a:graphicData>
+            </a:graphic>
+          </wp:inline>
+        </w:drawing>
+      </w:r>
     </w:p>
     <w:p>
       <w:pPr>
         <w:pStyle w:val="Cmsor1"/>
       </w:pPr>
       <w:r>
-        <w:t>Feladat: Rebase</w:t>
+        <w:t xml:space="preserve">Feladat: </w:t>
+      </w:r>
+      <w:proofErr w:type="spellStart"/>
+      <w:r>
+        <w:t>SonarQube</w:t>
+      </w:r>
+      <w:proofErr w:type="spellEnd"/>
+      <w:r>
+        <w:t xml:space="preserve"> </w:t>
+      </w:r>
+      <w:proofErr w:type="spellStart"/>
+      <w:r>
+        <w:t>for</w:t>
+      </w:r>
+      <w:proofErr w:type="spellEnd"/>
+      <w:r>
+        <w:t xml:space="preserve"> IDE (Statikus ellenőrzés lokálisan)</w:t>
       </w:r>
     </w:p>
     <w:p>
       <w:pPr>
         <w:pStyle w:val="Code"/>
       </w:pPr>
+      <w:r>
+        <w:t>Hibák:</w:t>
+      </w:r>
     </w:p>
     <w:p>
       <w:pPr>
-        <w:pStyle w:val="Cmsor1"/>
-      </w:pPr>
-      <w:r>
-        <w:lastRenderedPageBreak/>
-        <w:t xml:space="preserve">Feladat: </w:t>
-      </w:r>
-      <w:r>
-        <w:t>Commitok egyedi másolása</w:t>
+        <w:pStyle w:val="Code"/>
+        <w:numPr>
+          <w:ilvl w:val="0"/>
+          <w:numId w:val="7"/>
+        </w:numPr>
+      </w:pPr>
+      <w:r>
+        <w:t>Throw this exception or remove this useless statement.</w:t>
+      </w:r>
+      <w:r>
+        <w:t xml:space="preserve"> --- Ez egy valós hiba, az Exception csak egy üres „statement” ezért kell javítani.</w:t>
       </w:r>
     </w:p>
     <w:p>
       <w:pPr>
         <w:pStyle w:val="Code"/>
+        <w:numPr>
+          <w:ilvl w:val="0"/>
+          <w:numId w:val="7"/>
+        </w:numPr>
+      </w:pPr>
+      <w:r>
+        <w:t>Save and re-use this "Random".</w:t>
+      </w:r>
+      <w:r>
+        <w:t xml:space="preserve"> --- Ez JDK platform dependent, hogy tényleg random lesz-e a kimeneti eredmény, a SQ recommendation az az, hogy mentsük el és használjuk fel újra, ezért ezt én hibának vélem, mivel nem platform indpendent a működés és unintended sideeffect.</w:t>
+      </w:r>
+    </w:p>
+    <w:p>
+      <w:pPr>
+        <w:pStyle w:val="Code"/>
+        <w:numPr>
+          <w:ilvl w:val="0"/>
+          <w:numId w:val="7"/>
+        </w:numPr>
+      </w:pPr>
+      <w:r>
+        <w:t>Was "-=" meant instead?</w:t>
+      </w:r>
+      <w:r>
+        <w:t xml:space="preserve"> --- Ez egy valós hiba, mivel minuszá tesszük a torpedoCount-ot nem kivonunk belőle.</w:t>
+      </w:r>
+    </w:p>
+    <w:p>
+      <w:pPr>
+        <w:pStyle w:val="Code"/>
+      </w:pPr>
+      <w:r>
+        <w:lastRenderedPageBreak/>
+        <w:t>Szabályok:</w:t>
+      </w:r>
+    </w:p>
+    <w:p>
+      <w:pPr>
+        <w:pStyle w:val="Code"/>
+        <w:numPr>
+          <w:ilvl w:val="0"/>
+          <w:numId w:val="8"/>
+        </w:numPr>
+      </w:pPr>
+      <w:r>
+        <w:t>List.remove() should not be used in ascending ’for’ loop. ---causes element skipping.</w:t>
+      </w:r>
+    </w:p>
+    <w:p>
+      <w:pPr>
+        <w:pStyle w:val="Code"/>
+        <w:numPr>
+          <w:ilvl w:val="0"/>
+          <w:numId w:val="8"/>
+        </w:numPr>
+      </w:pPr>
+      <w:r>
+        <w:t>@NonNull values should not be set to null. --- can caues nullptr exception at runtime if the variable annotated with this is set to null.</w:t>
+      </w:r>
+    </w:p>
+    <w:p>
+      <w:pPr>
+        <w:pStyle w:val="Code"/>
+        <w:numPr>
+          <w:ilvl w:val="0"/>
+          <w:numId w:val="8"/>
+        </w:numPr>
+      </w:pPr>
+      <w:r>
+        <w:t xml:space="preserve">„==” and „!=” should not be used when „equals” is overriden. --- </w:t>
+      </w:r>
+      <w:r>
+        <w:t>It is equivalent to use the equality == operator and the equals method to compare two objects if the equals method inherited from Object has not been overridden. In this case both checks compare the object references.</w:t>
+      </w:r>
+      <w:r>
+        <w:t xml:space="preserve"> (Dokumentációbol kimásolva)</w:t>
+      </w:r>
+    </w:p>
+    <w:p>
+      <w:pPr>
+        <w:pStyle w:val="Code"/>
+      </w:pPr>
+    </w:p>
+    <w:p>
+      <w:pPr>
+        <w:pStyle w:val="Cmsor1"/>
+      </w:pPr>
+      <w:r>
+        <w:t xml:space="preserve">Feladat: </w:t>
+      </w:r>
+      <w:proofErr w:type="spellStart"/>
+      <w:r>
+        <w:t>Commitok</w:t>
+      </w:r>
+      <w:proofErr w:type="spellEnd"/>
+      <w:r>
+        <w:t xml:space="preserve"> egyedi másolása</w:t>
+      </w:r>
+    </w:p>
+    <w:p>
+      <w:pPr>
+        <w:pStyle w:val="Code"/>
       </w:pPr>
     </w:p>
     <w:sectPr>
-      <w:headerReference w:type="default" r:id="rId14"/>
-      <w:footerReference w:type="default" r:id="rId15"/>
-      <w:headerReference w:type="first" r:id="rId16"/>
-      <w:footerReference w:type="first" r:id="rId17"/>
+      <w:headerReference w:type="default" r:id="rId15"/>
+      <w:footerReference w:type="default" r:id="rId16"/>
+      <w:headerReference w:type="first" r:id="rId17"/>
+      <w:footerReference w:type="first" r:id="rId18"/>
       <w:pgSz w:w="11906" w:h="16838"/>
       <w:pgMar w:top="1417" w:right="1417" w:bottom="1417" w:left="1417" w:header="708" w:footer="708" w:gutter="0"/>
       <w:cols w:space="720"/>
@@ -1002,6 +1183,184 @@
     </w:lvl>
   </w:abstractNum>
   <w:abstractNum w:abstractNumId="1" w15:restartNumberingAfterBreak="0">
+    <w:nsid w:val="134561A7"/>
+    <w:multiLevelType w:val="hybridMultilevel"/>
+    <w:tmpl w:val="79FE69C0"/>
+    <w:lvl w:ilvl="0" w:tplc="040E000F">
+      <w:start w:val="1"/>
+      <w:numFmt w:val="decimal"/>
+      <w:lvlText w:val="%1."/>
+      <w:lvlJc w:val="left"/>
+      <w:pPr>
+        <w:ind w:left="720" w:hanging="360"/>
+      </w:pPr>
+      <w:rPr>
+        <w:rFonts w:hint="default"/>
+      </w:rPr>
+    </w:lvl>
+    <w:lvl w:ilvl="1" w:tplc="040E0019" w:tentative="1">
+      <w:start w:val="1"/>
+      <w:numFmt w:val="lowerLetter"/>
+      <w:lvlText w:val="%2."/>
+      <w:lvlJc w:val="left"/>
+      <w:pPr>
+        <w:ind w:left="1440" w:hanging="360"/>
+      </w:pPr>
+    </w:lvl>
+    <w:lvl w:ilvl="2" w:tplc="040E001B" w:tentative="1">
+      <w:start w:val="1"/>
+      <w:numFmt w:val="lowerRoman"/>
+      <w:lvlText w:val="%3."/>
+      <w:lvlJc w:val="right"/>
+      <w:pPr>
+        <w:ind w:left="2160" w:hanging="180"/>
+      </w:pPr>
+    </w:lvl>
+    <w:lvl w:ilvl="3" w:tplc="040E000F" w:tentative="1">
+      <w:start w:val="1"/>
+      <w:numFmt w:val="decimal"/>
+      <w:lvlText w:val="%4."/>
+      <w:lvlJc w:val="left"/>
+      <w:pPr>
+        <w:ind w:left="2880" w:hanging="360"/>
+      </w:pPr>
+    </w:lvl>
+    <w:lvl w:ilvl="4" w:tplc="040E0019" w:tentative="1">
+      <w:start w:val="1"/>
+      <w:numFmt w:val="lowerLetter"/>
+      <w:lvlText w:val="%5."/>
+      <w:lvlJc w:val="left"/>
+      <w:pPr>
+        <w:ind w:left="3600" w:hanging="360"/>
+      </w:pPr>
+    </w:lvl>
+    <w:lvl w:ilvl="5" w:tplc="040E001B" w:tentative="1">
+      <w:start w:val="1"/>
+      <w:numFmt w:val="lowerRoman"/>
+      <w:lvlText w:val="%6."/>
+      <w:lvlJc w:val="right"/>
+      <w:pPr>
+        <w:ind w:left="4320" w:hanging="180"/>
+      </w:pPr>
+    </w:lvl>
+    <w:lvl w:ilvl="6" w:tplc="040E000F" w:tentative="1">
+      <w:start w:val="1"/>
+      <w:numFmt w:val="decimal"/>
+      <w:lvlText w:val="%7."/>
+      <w:lvlJc w:val="left"/>
+      <w:pPr>
+        <w:ind w:left="5040" w:hanging="360"/>
+      </w:pPr>
+    </w:lvl>
+    <w:lvl w:ilvl="7" w:tplc="040E0019" w:tentative="1">
+      <w:start w:val="1"/>
+      <w:numFmt w:val="lowerLetter"/>
+      <w:lvlText w:val="%8."/>
+      <w:lvlJc w:val="left"/>
+      <w:pPr>
+        <w:ind w:left="5760" w:hanging="360"/>
+      </w:pPr>
+    </w:lvl>
+    <w:lvl w:ilvl="8" w:tplc="040E001B" w:tentative="1">
+      <w:start w:val="1"/>
+      <w:numFmt w:val="lowerRoman"/>
+      <w:lvlText w:val="%9."/>
+      <w:lvlJc w:val="right"/>
+      <w:pPr>
+        <w:ind w:left="6480" w:hanging="180"/>
+      </w:pPr>
+    </w:lvl>
+  </w:abstractNum>
+  <w:abstractNum w:abstractNumId="2" w15:restartNumberingAfterBreak="0">
+    <w:nsid w:val="25560042"/>
+    <w:multiLevelType w:val="hybridMultilevel"/>
+    <w:tmpl w:val="3D22C192"/>
+    <w:lvl w:ilvl="0" w:tplc="040E000F">
+      <w:start w:val="1"/>
+      <w:numFmt w:val="decimal"/>
+      <w:lvlText w:val="%1."/>
+      <w:lvlJc w:val="left"/>
+      <w:pPr>
+        <w:ind w:left="720" w:hanging="360"/>
+      </w:pPr>
+      <w:rPr>
+        <w:rFonts w:hint="default"/>
+      </w:rPr>
+    </w:lvl>
+    <w:lvl w:ilvl="1" w:tplc="040E0019">
+      <w:start w:val="1"/>
+      <w:numFmt w:val="lowerLetter"/>
+      <w:lvlText w:val="%2."/>
+      <w:lvlJc w:val="left"/>
+      <w:pPr>
+        <w:ind w:left="1440" w:hanging="360"/>
+      </w:pPr>
+    </w:lvl>
+    <w:lvl w:ilvl="2" w:tplc="040E001B">
+      <w:start w:val="1"/>
+      <w:numFmt w:val="lowerRoman"/>
+      <w:lvlText w:val="%3."/>
+      <w:lvlJc w:val="right"/>
+      <w:pPr>
+        <w:ind w:left="2160" w:hanging="180"/>
+      </w:pPr>
+    </w:lvl>
+    <w:lvl w:ilvl="3" w:tplc="040E000F" w:tentative="1">
+      <w:start w:val="1"/>
+      <w:numFmt w:val="decimal"/>
+      <w:lvlText w:val="%4."/>
+      <w:lvlJc w:val="left"/>
+      <w:pPr>
+        <w:ind w:left="2880" w:hanging="360"/>
+      </w:pPr>
+    </w:lvl>
+    <w:lvl w:ilvl="4" w:tplc="040E0019" w:tentative="1">
+      <w:start w:val="1"/>
+      <w:numFmt w:val="lowerLetter"/>
+      <w:lvlText w:val="%5."/>
+      <w:lvlJc w:val="left"/>
+      <w:pPr>
+        <w:ind w:left="3600" w:hanging="360"/>
+      </w:pPr>
+    </w:lvl>
+    <w:lvl w:ilvl="5" w:tplc="040E001B" w:tentative="1">
+      <w:start w:val="1"/>
+      <w:numFmt w:val="lowerRoman"/>
+      <w:lvlText w:val="%6."/>
+      <w:lvlJc w:val="right"/>
+      <w:pPr>
+        <w:ind w:left="4320" w:hanging="180"/>
+      </w:pPr>
+    </w:lvl>
+    <w:lvl w:ilvl="6" w:tplc="040E000F" w:tentative="1">
+      <w:start w:val="1"/>
+      <w:numFmt w:val="decimal"/>
+      <w:lvlText w:val="%7."/>
+      <w:lvlJc w:val="left"/>
+      <w:pPr>
+        <w:ind w:left="5040" w:hanging="360"/>
+      </w:pPr>
+    </w:lvl>
+    <w:lvl w:ilvl="7" w:tplc="040E0019" w:tentative="1">
+      <w:start w:val="1"/>
+      <w:numFmt w:val="lowerLetter"/>
+      <w:lvlText w:val="%8."/>
+      <w:lvlJc w:val="left"/>
+      <w:pPr>
+        <w:ind w:left="5760" w:hanging="360"/>
+      </w:pPr>
+    </w:lvl>
+    <w:lvl w:ilvl="8" w:tplc="040E001B" w:tentative="1">
+      <w:start w:val="1"/>
+      <w:numFmt w:val="lowerRoman"/>
+      <w:lvlText w:val="%9."/>
+      <w:lvlJc w:val="right"/>
+      <w:pPr>
+        <w:ind w:left="6480" w:hanging="180"/>
+      </w:pPr>
+    </w:lvl>
+  </w:abstractNum>
+  <w:abstractNum w:abstractNumId="3" w15:restartNumberingAfterBreak="0">
     <w:nsid w:val="384A2488"/>
     <w:multiLevelType w:val="multilevel"/>
     <w:tmpl w:val="C67E6438"/>
@@ -1132,7 +1491,96 @@
       </w:pPr>
     </w:lvl>
   </w:abstractNum>
-  <w:abstractNum w:abstractNumId="2" w15:restartNumberingAfterBreak="0">
+  <w:abstractNum w:abstractNumId="4" w15:restartNumberingAfterBreak="0">
+    <w:nsid w:val="4BB93C2E"/>
+    <w:multiLevelType w:val="hybridMultilevel"/>
+    <w:tmpl w:val="C67AEB06"/>
+    <w:lvl w:ilvl="0" w:tplc="040E000F">
+      <w:start w:val="1"/>
+      <w:numFmt w:val="decimal"/>
+      <w:lvlText w:val="%1."/>
+      <w:lvlJc w:val="left"/>
+      <w:pPr>
+        <w:ind w:left="720" w:hanging="360"/>
+      </w:pPr>
+      <w:rPr>
+        <w:rFonts w:hint="default"/>
+      </w:rPr>
+    </w:lvl>
+    <w:lvl w:ilvl="1" w:tplc="040E0019" w:tentative="1">
+      <w:start w:val="1"/>
+      <w:numFmt w:val="lowerLetter"/>
+      <w:lvlText w:val="%2."/>
+      <w:lvlJc w:val="left"/>
+      <w:pPr>
+        <w:ind w:left="1440" w:hanging="360"/>
+      </w:pPr>
+    </w:lvl>
+    <w:lvl w:ilvl="2" w:tplc="040E001B" w:tentative="1">
+      <w:start w:val="1"/>
+      <w:numFmt w:val="lowerRoman"/>
+      <w:lvlText w:val="%3."/>
+      <w:lvlJc w:val="right"/>
+      <w:pPr>
+        <w:ind w:left="2160" w:hanging="180"/>
+      </w:pPr>
+    </w:lvl>
+    <w:lvl w:ilvl="3" w:tplc="040E000F" w:tentative="1">
+      <w:start w:val="1"/>
+      <w:numFmt w:val="decimal"/>
+      <w:lvlText w:val="%4."/>
+      <w:lvlJc w:val="left"/>
+      <w:pPr>
+        <w:ind w:left="2880" w:hanging="360"/>
+      </w:pPr>
+    </w:lvl>
+    <w:lvl w:ilvl="4" w:tplc="040E0019" w:tentative="1">
+      <w:start w:val="1"/>
+      <w:numFmt w:val="lowerLetter"/>
+      <w:lvlText w:val="%5."/>
+      <w:lvlJc w:val="left"/>
+      <w:pPr>
+        <w:ind w:left="3600" w:hanging="360"/>
+      </w:pPr>
+    </w:lvl>
+    <w:lvl w:ilvl="5" w:tplc="040E001B" w:tentative="1">
+      <w:start w:val="1"/>
+      <w:numFmt w:val="lowerRoman"/>
+      <w:lvlText w:val="%6."/>
+      <w:lvlJc w:val="right"/>
+      <w:pPr>
+        <w:ind w:left="4320" w:hanging="180"/>
+      </w:pPr>
+    </w:lvl>
+    <w:lvl w:ilvl="6" w:tplc="040E000F" w:tentative="1">
+      <w:start w:val="1"/>
+      <w:numFmt w:val="decimal"/>
+      <w:lvlText w:val="%7."/>
+      <w:lvlJc w:val="left"/>
+      <w:pPr>
+        <w:ind w:left="5040" w:hanging="360"/>
+      </w:pPr>
+    </w:lvl>
+    <w:lvl w:ilvl="7" w:tplc="040E0019" w:tentative="1">
+      <w:start w:val="1"/>
+      <w:numFmt w:val="lowerLetter"/>
+      <w:lvlText w:val="%8."/>
+      <w:lvlJc w:val="left"/>
+      <w:pPr>
+        <w:ind w:left="5760" w:hanging="360"/>
+      </w:pPr>
+    </w:lvl>
+    <w:lvl w:ilvl="8" w:tplc="040E001B" w:tentative="1">
+      <w:start w:val="1"/>
+      <w:numFmt w:val="lowerRoman"/>
+      <w:lvlText w:val="%9."/>
+      <w:lvlJc w:val="right"/>
+      <w:pPr>
+        <w:ind w:left="6480" w:hanging="180"/>
+      </w:pPr>
+    </w:lvl>
+  </w:abstractNum>
+  <w:abstractNum w:abstractNumId="5" w15:restartNumberingAfterBreak="0">
     <w:nsid w:val="5FFC14D6"/>
     <w:multiLevelType w:val="multilevel"/>
     <w:tmpl w:val="0EF2A044"/>
@@ -1249,7 +1697,7 @@
       </w:pPr>
     </w:lvl>
   </w:abstractNum>
-  <w:abstractNum w:abstractNumId="3" w15:restartNumberingAfterBreak="0">
+  <w:abstractNum w:abstractNumId="6" w15:restartNumberingAfterBreak="0">
     <w:nsid w:val="6C680E3A"/>
     <w:multiLevelType w:val="multilevel"/>
     <w:tmpl w:val="FEEA1DB0"/>
@@ -1364,22 +1812,31 @@
     </w:lvl>
   </w:abstractNum>
   <w:num w:numId="1" w16cid:durableId="1513833424">
-    <w:abstractNumId w:val="1"/>
+    <w:abstractNumId w:val="3"/>
   </w:num>
   <w:num w:numId="2" w16cid:durableId="230849920">
     <w:abstractNumId w:val="0"/>
   </w:num>
   <w:num w:numId="3" w16cid:durableId="1996839382">
-    <w:abstractNumId w:val="2"/>
+    <w:abstractNumId w:val="5"/>
   </w:num>
   <w:num w:numId="4" w16cid:durableId="2050371267">
-    <w:abstractNumId w:val="3"/>
+    <w:abstractNumId w:val="6"/>
   </w:num>
   <w:num w:numId="5" w16cid:durableId="843663299">
-    <w:abstractNumId w:val="1"/>
+    <w:abstractNumId w:val="3"/>
     <w:lvlOverride w:ilvl="0">
       <w:startOverride w:val="1"/>
     </w:lvlOverride>
+  </w:num>
+  <w:num w:numId="6" w16cid:durableId="1862667389">
+    <w:abstractNumId w:val="1"/>
+  </w:num>
+  <w:num w:numId="7" w16cid:durableId="1906990810">
+    <w:abstractNumId w:val="2"/>
+  </w:num>
+  <w:num w:numId="8" w16cid:durableId="275646553">
+    <w:abstractNumId w:val="4"/>
   </w:num>
 </w:numbering>
 </file>

</xml_diff>